<commit_message>
vault backup: 2026-09-16 14:15:53
</commit_message>
<xml_diff>
--- a/Investigare/Avventura Tanto Rumore/DOSSIER_GM.docx
+++ b/Investigare/Avventura Tanto Rumore/DOSSIER_GM.docx
@@ -1068,7 +1068,7 @@
           <w:i w:val="0"/>
           <w:sz w:val="21"/>
         </w:rPr>
-        <w:t>La banda al completo arriva sul lavoro della vittima, con scuse, cosi diranno i testimoni, attaccano briga con la vittima che viene uccisa con un colpo alle spalle con un oggetto contundente. Se mostrate le foto vengono riconosciuti dal collega e dal titolare ma il titolare non collaborano subito ha paura di ritorsioni, la dipendente dice che era nel retro ed è rientrata in sala solo dopo il colpo; in realtà era in sala e ha visto tutto.</w:t>
+        <w:t>Alle 21:14 circa arriva la banda; il colpo mortale viene sferrato intorno alle 21:15. La banda al completo arriva sul lavoro della vittima, con scuse, cosi diranno i testimoni, attaccano briga con la vittima che viene uccisa con un colpo alle spalle con un oggetto contundente. Se mostrate le foto vengono riconosciuti dal collega e dal titolare ma il titolare non collaborano subito ha paura di ritorsioni, la dipendente dice che era nel retro ed è rientrata in sala solo dopo il colpo; in realtà era in sala e ha visto tutto.</w:t>
       </w:r>
     </w:p>
     <w:p>
@@ -1872,7 +1872,7 @@
           <w:i w:val="0"/>
           <w:sz w:val="19"/>
         </w:rPr>
-        <w:t>· 1997-05-24 21:14 · SnakUp — La banda al completo arriva sul lavoro della vittima, con scuse, cosi diranno i testimoni, attaccano briga con la vittima che viene uccisa con un colpo alle spalle con un oggetto contundente. Se mostrate le foto vengono riconosciuti dal collega e dal titolare ma il titolare non collaborano subito ha paura di ritorsioni, la dipendente dice che era nel retro ed è rientrata in sala solo dopo il colpo; in realtà era in sala e ha visto tutto.</w:t>
+        <w:t>· 1997-05-24 21:14 · SnakUp — Alle 21:14 circa arriva la banda; il colpo mortale viene sferrato intorno alle 21:15. La banda al completo arriva sul lavoro della vittima, con scuse, cosi diranno i testimoni, attaccano briga con la vittima che viene uccisa con un colpo alle spalle con un oggetto contundente. Se mostrate le foto vengono riconosciuti dal collega e dal titolare ma il titolare non collaborano subito ha paura di ritorsioni, la dipendente dice che era nel retro ed è rientrata in sala solo dopo il colpo; in realtà era in sala e ha visto tutto.</w:t>
       </w:r>
     </w:p>
     <w:p>
@@ -2263,6 +2263,20 @@
           <w:sz w:val="20"/>
         </w:rPr>
         <w:t>Dovevo insistere. Questo lo so io, e me lo porto dietro.</w:t>
+      </w:r>
+    </w:p>
+    <w:p>
+      <w:pPr>
+        <w:spacing w:after="60" w:before="0"/>
+      </w:pPr>
+      <w:r>
+        <w:rPr>
+          <w:b w:val="0"/>
+          <w:i w:val="0"/>
+          <w:color w:val="8B1A1A"/>
+          <w:sz w:val="18"/>
+        </w:rPr>
+        <w:t>AVVISO PER IL MASTER — CONSEGNA: Dal 25/05/1997, dopo il colloquio con questa persona; compilare data, ora e luogo effettivi del verbale. Non distribuire tutte le deposizioni al briefing.</w:t>
       </w:r>
     </w:p>
     <w:p>
@@ -2507,7 +2521,7 @@
           <w:i w:val="0"/>
           <w:sz w:val="19"/>
         </w:rPr>
-        <w:t>· 1997-05-24 21:14 · SnakUp — La banda al completo arriva sul lavoro della vittima, con scuse, cosi diranno i testimoni, attaccano briga con la vittima che viene uccisa con un colpo alle spalle con un oggetto contundente. Se mostrate le foto vengono riconosciuti dal collega e dal titolare ma il titolare non collaborano subito ha paura di ritorsioni, la dipendente dice che era nel retro ed è rientrata in sala solo dopo il colpo; in realtà era in sala e ha visto tutto.</w:t>
+        <w:t>· 1997-05-24 21:14 · SnakUp — Alle 21:14 circa arriva la banda; il colpo mortale viene sferrato intorno alle 21:15. La banda al completo arriva sul lavoro della vittima, con scuse, cosi diranno i testimoni, attaccano briga con la vittima che viene uccisa con un colpo alle spalle con un oggetto contundente. Se mostrate le foto vengono riconosciuti dal collega e dal titolare ma il titolare non collaborano subito ha paura di ritorsioni, la dipendente dice che era nel retro ed è rientrata in sala solo dopo il colpo; in realtà era in sala e ha visto tutto.</w:t>
       </w:r>
     </w:p>
     <w:p>
@@ -2633,6 +2647,20 @@
           <w:sz w:val="20"/>
         </w:rPr>
         <w:t>Sono rimasta io vicino a Yuta mentre il titolare chiamava la polizia. Non respirava già più.</w:t>
+      </w:r>
+    </w:p>
+    <w:p>
+      <w:pPr>
+        <w:spacing w:after="60" w:before="0"/>
+      </w:pPr>
+      <w:r>
+        <w:rPr>
+          <w:b w:val="0"/>
+          <w:i w:val="0"/>
+          <w:color w:val="8B1A1A"/>
+          <w:sz w:val="18"/>
+        </w:rPr>
+        <w:t>AVVISO PER IL MASTER — CONSEGNA: Dal 25/05/1997, dopo il colloquio con questa persona; compilare data, ora e luogo effettivi del verbale. Non distribuire tutte le deposizioni al briefing. Questo è il primo racconto reticente. Le informazioni ottenute rassicurando il testimone vanno annotate come integrazione successiva.</w:t>
       </w:r>
     </w:p>
     <w:p>
@@ -2863,7 +2891,7 @@
           <w:i w:val="0"/>
           <w:sz w:val="19"/>
         </w:rPr>
-        <w:t>· 1997-05-24 21:14 · SnakUp — La banda al completo arriva sul lavoro della vittima, con scuse, cosi diranno i testimoni, attaccano briga con la vittima che viene uccisa con un colpo alle spalle con un oggetto contundente. Se mostrate le foto vengono riconosciuti dal collega e dal titolare ma il titolare non collaborano subito ha paura di ritorsioni, la dipendente dice che era nel retro ed è rientrata in sala solo dopo il colpo; in realtà era in sala e ha visto tutto.</w:t>
+        <w:t>· 1997-05-24 21:14 · SnakUp — Alle 21:14 circa arriva la banda; il colpo mortale viene sferrato intorno alle 21:15. La banda al completo arriva sul lavoro della vittima, con scuse, cosi diranno i testimoni, attaccano briga con la vittima che viene uccisa con un colpo alle spalle con un oggetto contundente. Se mostrate le foto vengono riconosciuti dal collega e dal titolare ma il titolare non collaborano subito ha paura di ritorsioni, la dipendente dice che era nel retro ed è rientrata in sala solo dopo il colpo; in realtà era in sala e ha visto tutto.</w:t>
       </w:r>
     </w:p>
     <w:p>
@@ -3017,6 +3045,20 @@
           <w:sz w:val="20"/>
         </w:rPr>
         <w:t>Altro non so, ispettore. Io qui ci lavoro tutte le sere, e la gente del quartiere passa davanti alla mia vetrina tutte le sere. Mi capisce.</w:t>
+      </w:r>
+    </w:p>
+    <w:p>
+      <w:pPr>
+        <w:spacing w:after="60" w:before="0"/>
+      </w:pPr>
+      <w:r>
+        <w:rPr>
+          <w:b w:val="0"/>
+          <w:i w:val="0"/>
+          <w:color w:val="8B1A1A"/>
+          <w:sz w:val="18"/>
+        </w:rPr>
+        <w:t>AVVISO PER IL MASTER — CONSEGNA: Dal 25/05/1997, dopo il colloquio con questa persona; compilare data, ora e luogo effettivi del verbale. Non distribuire tutte le deposizioni al briefing. Questo è il primo racconto reticente. Le informazioni ottenute rassicurando il testimone vanno annotate come integrazione successiva.</w:t>
       </w:r>
     </w:p>
     <w:p>
@@ -3429,6 +3471,20 @@
           <w:sz w:val="20"/>
         </w:rPr>
         <w:t>L'ultima volta che l'ho sentito mi ha detto che dopo gli esami veniva a pranzo a casa.»</w:t>
+      </w:r>
+    </w:p>
+    <w:p>
+      <w:pPr>
+        <w:spacing w:after="60" w:before="0"/>
+      </w:pPr>
+      <w:r>
+        <w:rPr>
+          <w:b w:val="0"/>
+          <w:i w:val="0"/>
+          <w:color w:val="8B1A1A"/>
+          <w:sz w:val="18"/>
+        </w:rPr>
+        <w:t>AVVISO PER IL MASTER — CONSEGNA: Dal 25/05/1997, dopo il colloquio con questa persona; compilare data, ora e luogo effettivi del verbale. Non distribuire tutte le deposizioni al briefing.</w:t>
       </w:r>
     </w:p>
     <w:p>
@@ -4010,6 +4066,20 @@
     </w:p>
     <w:p>
       <w:pPr>
+        <w:spacing w:after="60" w:before="0"/>
+      </w:pPr>
+      <w:r>
+        <w:rPr>
+          <w:b w:val="0"/>
+          <w:i w:val="0"/>
+          <w:color w:val="8B1A1A"/>
+          <w:sz w:val="18"/>
+        </w:rPr>
+        <w:t>AVVISO PER IL MASTER — CONSEGNA: Dal 25/05/1997, dopo il colloquio con questa persona; compilare data, ora e luogo effettivi del verbale. Non distribuire tutte le deposizioni al briefing.</w:t>
+      </w:r>
+    </w:p>
+    <w:p>
+      <w:pPr>
         <w:spacing w:after="100" w:before="200"/>
         <w:jc w:val="center"/>
       </w:pPr>
@@ -4159,7 +4229,7 @@
           <w:i w:val="0"/>
           <w:sz w:val="19"/>
         </w:rPr>
-        <w:t>· 1997-05-24 21:14 · SnakUp — La banda al completo arriva sul lavoro della vittima, con scuse, cosi diranno i testimoni, attaccano briga con la vittima che viene uccisa con un colpo alle spalle con un oggetto contundente. Se mostrate le foto vengono riconosciuti dal collega e dal titolare ma il titolare non collaborano subito ha paura di ritorsioni, la dipendente dice che era nel retro ed è rientrata in sala solo dopo il colpo; in realtà era in sala e ha visto tutto.</w:t>
+        <w:t>· 1997-05-24 21:14 · SnakUp — Alle 21:14 circa arriva la banda; il colpo mortale viene sferrato intorno alle 21:15. La banda al completo arriva sul lavoro della vittima, con scuse, cosi diranno i testimoni, attaccano briga con la vittima che viene uccisa con un colpo alle spalle con un oggetto contundente. Se mostrate le foto vengono riconosciuti dal collega e dal titolare ma il titolare non collaborano subito ha paura di ritorsioni, la dipendente dice che era nel retro ed è rientrata in sala solo dopo il colpo; in realtà era in sala e ha visto tutto.</w:t>
       </w:r>
     </w:p>
     <w:p>
@@ -4452,7 +4522,7 @@
         <w:t>Le due motociclette segnalate — Honda CBX400F, livrea bianco-rossa «tricolor», targa piegata verso l'alto, sella a tre gradini con schienalone cromato, scarichi takeyari smarmittati — corrispondono a due esemplari ben noti a questo posto di polizia: appartengono al gruppo di motociclisti (bōsōzoku) che fa capo a MATSUI Kenta, responsabile in zona di schiamazzi notturni, gare su strada e danneggiamenti. Si allega fotografia di polizia del suddetto.</w:t>
         <w:br/>
         <w:br/>
-        <w:t>Il gruppo conta quattro-cinque elementi stabili. Si segnala inoltre che l'elemento di spicco SUGIMOTO Hideki (anni 24) è stato sottoposto a controllo dal sottoscritto in data 15 maggio u.s., in Kamigyō: si guardava attorno con insistenza, come chi segue qualcuno; nulla da contestare al momento del controllo.</w:t>
+        <w:t>Il gruppo conta quattro-cinque elementi stabili. Si segnala inoltre che l'elemento di spicco SUGIMOTO Hideki (anni 24) è stato sottoposto a controllo dal sottoscritto in data 15 maggio 1997, in Kamigyō: si guardava attorno con insistenza, come chi segue qualcuno; nulla da contestare al momento del controllo.</w:t>
         <w:br/>
         <w:br/>
         <w:t>Per l'ubicazione del ritrovo abituale del gruppo, questo ufficio può fornire riscontro su richiesta specifica.</w:t>
@@ -4463,6 +4533,21 @@
     </w:p>
     <w:p>
       <w:pPr>
+        <w:spacing w:after="60" w:before="0"/>
+        <w:ind w:left="283"/>
+      </w:pPr>
+      <w:r>
+        <w:rPr>
+          <w:b w:val="0"/>
+          <w:i w:val="0"/>
+          <w:color w:val="8B1A1A"/>
+          <w:sz w:val="18"/>
+        </w:rPr>
+        <w:t>AVVISO PER IL MASTER — CONSEGNA: Dal 25/05/1997, dopo la richiesta che descrive le due moto: riscontro telefonico entro un’ora, copia scritta e fascicolo fotografico entro due ore dalla richiesta. Sono documenti e conoscenze già disponibili al kōban: non applicare i tempi di nuove analisi o di trasferimento di un fascicolo originale. Annotare data e ora effettive di consegna. Il fascicolo allegato è aggiornato al 15/05/1997; la fotografia al suo interno è precedente. Non rivela dove si trova il covo.</w:t>
+      </w:r>
+    </w:p>
+    <w:p>
+      <w:pPr>
         <w:spacing w:after="20" w:before="0"/>
         <w:ind w:left="283"/>
       </w:pPr>
@@ -4478,7 +4563,7 @@
         <w:t>Da appostamenti di questo ufficio e da segnalazioni ripetute dei residenti (motori a tarda notte), il gruppo dispone in uso stabile di un capannone tra i capannoni industriali di Murasakino, Kita-ku: una ex fabbrica con cortile di carico e guardiola sull'ingresso. Le due CBX400F vi sono state viste rientrare più volte, anche nelle ultime settimane.</w:t>
         <w:br/>
         <w:br/>
-        <w:t>Si allega planimetria di massima. Si raccomanda prudenza: il gruppo non ha mai mostrato disponibilità al dialogo con questo ufficio.</w:t>
+        <w:t>Il posto è noto a questo ufficio, che fornisce al distretto le indicazioni per raggiungerlo. Si raccomanda prudenza: il gruppo non ha mai mostrato disponibilità al dialogo con questo ufficio.</w:t>
         <w:br/>
         <w:br/>
         <w:t>Il capo posto — SUZUKI Nobuyuki 鈴木 信之 — diventa handout: «Magazzino — Kōban di Kamigyō»</w:t>
@@ -4486,6 +4571,21 @@
     </w:p>
     <w:p>
       <w:pPr>
+        <w:spacing w:after="60" w:before="0"/>
+        <w:ind w:left="283"/>
+      </w:pPr>
+      <w:r>
+        <w:rPr>
+          <w:b w:val="0"/>
+          <w:i w:val="0"/>
+          <w:color w:val="8B1A1A"/>
+          <w:sz w:val="18"/>
+        </w:rPr>
+        <w:t>AVVISO PER IL MASTER — CONSEGNA: Dal 25/05/1997, dopo una richiesta specifica sul ritrovo del gruppo (anche insieme alla richiesta sulle moto, se i PG la formulano): indicazioni entro un’ora, copia scritta entro due ore. La risposta permette di raggiungere il capannone, senza un altro ostacolo sull’indirizzo. MAPPA E TRE IMMAGINI DEL COVO: materiale di scena del master, da mostrare solo nel finale al capannone, per ambientazione e combattimento; non sono allegati da consegnare con questa risposta.</w:t>
+      </w:r>
+    </w:p>
+    <w:p>
+      <w:pPr>
         <w:spacing w:after="40" w:before="120"/>
       </w:pPr>
       <w:r>
@@ -4705,7 +4805,7 @@
           <w:i w:val="0"/>
           <w:sz w:val="19"/>
         </w:rPr>
-        <w:t>· 1997-05-24 21:14 · SnakUp — La banda al completo arriva sul lavoro della vittima, con scuse, cosi diranno i testimoni, attaccano briga con la vittima che viene uccisa con un colpo alle spalle con un oggetto contundente. Se mostrate le foto vengono riconosciuti dal collega e dal titolare ma il titolare non collaborano subito ha paura di ritorsioni, la dipendente dice che era nel retro ed è rientrata in sala solo dopo il colpo; in realtà era in sala e ha visto tutto.</w:t>
+        <w:t>· 1997-05-24 21:14 · SnakUp — Alle 21:14 circa arriva la banda; il colpo mortale viene sferrato intorno alle 21:15. La banda al completo arriva sul lavoro della vittima, con scuse, cosi diranno i testimoni, attaccano briga con la vittima che viene uccisa con un colpo alle spalle con un oggetto contundente. Se mostrate le foto vengono riconosciuti dal collega e dal titolare ma il titolare non collaborano subito ha paura di ritorsioni, la dipendente dice che era nel retro ed è rientrata in sala solo dopo il colpo; in realtà era in sala e ha visto tutto.</w:t>
       </w:r>
     </w:p>
     <w:p>
@@ -5041,7 +5141,7 @@
           <w:i w:val="0"/>
           <w:sz w:val="20"/>
         </w:rPr>
-        <w:t>Quando scopre della morte di Shimada Yuta per una settimana non va a scuola, la si può trovare a casa, in pratica dal 26/05/1997</w:t>
+        <w:t>Se nessuno l’ha avvertita prima, scopre la morte dal giornale lunedì 26/05/1997 mattina; da quel giorno non va a scuola per una settimana e si trova a casa. Se i PG la raggiungono domenica 25 e glielo comunicano, apprende la notizia da loro in quella scena.</w:t>
       </w:r>
     </w:p>
     <w:p>
@@ -5506,7 +5606,7 @@
           <w:i/>
           <w:sz w:val="20"/>
         </w:rPr>
-        <w:t>Quella sera lì, il ventiquattro, io ero a casa. L'ho saputo il giorno dopo, dal giornale, mia madre me l'ha messo davanti senza dire niente. Da allora a scuola non ci sono più andata. Non ci riesco.</w:t>
+        <w:t>Quella sera lì, il ventiquattro, io ero a casa. L'ho saputo lunedì ventisei maggio, dal giornale, mia madre me l'ha messo davanti senza dire niente. Da allora a scuola non ci sono più andata. Non ci riesco.</w:t>
       </w:r>
     </w:p>
     <w:p>
@@ -5567,6 +5667,20 @@
     </w:p>
     <w:p>
       <w:pPr>
+        <w:spacing w:after="60" w:before="0"/>
+      </w:pPr>
+      <w:r>
+        <w:rPr>
+          <w:b w:val="0"/>
+          <w:i w:val="0"/>
+          <w:color w:val="8B1A1A"/>
+          <w:sz w:val="18"/>
+        </w:rPr>
+        <w:t>AVVISO PER IL MASTER — CONSEGNA: Versione stampata utilizzabile dal 26/05/1997 mattina, dopo che Noriko ha letto il giornale e dopo il colloquio. Se i PG le comunicano la morte il 25, non consegnare questo testo: giocare il colloquio e verbalizzare quanto dice realmente, con quella data e quella fonte della notizia. Il primo racconto è reticente; annotare separatamente la successiva collaborazione. Compilare data, ora e luogo effettivi, senza attendere il 26 per permettere ai PG di parlarle.</w:t>
+      </w:r>
+    </w:p>
+    <w:p>
+      <w:pPr>
         <w:spacing w:after="100" w:before="200"/>
         <w:jc w:val="center"/>
       </w:pPr>
@@ -5674,7 +5788,7 @@
           <w:i w:val="0"/>
           <w:sz w:val="19"/>
         </w:rPr>
-        <w:t>· 1997-05-24 21:14 · SnakUp — La banda al completo arriva sul lavoro della vittima, con scuse, cosi diranno i testimoni, attaccano briga con la vittima che viene uccisa con un colpo alle spalle con un oggetto contundente. Se mostrate le foto vengono riconosciuti dal collega e dal titolare ma il titolare non collaborano subito ha paura di ritorsioni, la dipendente dice che era nel retro ed è rientrata in sala solo dopo il colpo; in realtà era in sala e ha visto tutto.</w:t>
+        <w:t>· 1997-05-24 21:14 · SnakUp — Alle 21:14 circa arriva la banda; il colpo mortale viene sferrato intorno alle 21:15. La banda al completo arriva sul lavoro della vittima, con scuse, cosi diranno i testimoni, attaccano briga con la vittima che viene uccisa con un colpo alle spalle con un oggetto contundente. Se mostrate le foto vengono riconosciuti dal collega e dal titolare ma il titolare non collaborano subito ha paura di ritorsioni, la dipendente dice che era nel retro ed è rientrata in sala solo dopo il colpo; in realtà era in sala e ha visto tutto.</w:t>
       </w:r>
     </w:p>
     <w:p>
@@ -8319,7 +8433,7 @@
         <w:t>Le due motociclette segnalate — Honda CBX400F, livrea bianco-rossa «tricolor», targa piegata verso l'alto, sella a tre gradini con schienalone cromato, scarichi takeyari smarmittati — corrispondono a due esemplari ben noti a questo posto di polizia: appartengono al gruppo di motociclisti (bōsōzoku) che fa capo a MATSUI Kenta, responsabile in zona di schiamazzi notturni, gare su strada e danneggiamenti. Si allega fotografia di polizia del suddetto.</w:t>
         <w:br/>
         <w:br/>
-        <w:t>Il gruppo conta quattro-cinque elementi stabili. Si segnala inoltre che l'elemento di spicco SUGIMOTO Hideki (anni 24) è stato sottoposto a controllo dal sottoscritto in data 15 maggio u.s., in Kamigyō: si guardava attorno con insistenza, come chi segue qualcuno; nulla da contestare al momento del controllo.</w:t>
+        <w:t>Il gruppo conta quattro-cinque elementi stabili. Si segnala inoltre che l'elemento di spicco SUGIMOTO Hideki (anni 24) è stato sottoposto a controllo dal sottoscritto in data 15 maggio 1997, in Kamigyō: si guardava attorno con insistenza, come chi segue qualcuno; nulla da contestare al momento del controllo.</w:t>
         <w:br/>
         <w:br/>
         <w:t>Per l'ubicazione del ritrovo abituale del gruppo, questo ufficio può fornire riscontro su richiesta specifica.</w:t>
@@ -8344,6 +8458,21 @@
     </w:p>
     <w:p>
       <w:pPr>
+        <w:spacing w:after="60" w:before="0"/>
+        <w:ind w:left="454"/>
+      </w:pPr>
+      <w:r>
+        <w:rPr>
+          <w:b w:val="0"/>
+          <w:i w:val="0"/>
+          <w:color w:val="8B1A1A"/>
+          <w:sz w:val="18"/>
+        </w:rPr>
+        <w:t>AVVISO PER IL MASTER — CONSEGNA: Dal 25/05/1997, dopo la richiesta che descrive le due moto: riscontro telefonico entro un’ora, copia scritta e fascicolo fotografico entro due ore dalla richiesta. Sono documenti e conoscenze già disponibili al kōban: non applicare i tempi di nuove analisi o di trasferimento di un fascicolo originale. Annotare data e ora effettive di consegna. Il fascicolo allegato è aggiornato al 15/05/1997; la fotografia al suo interno è precedente. Non rivela dove si trova il covo.</w:t>
+      </w:r>
+    </w:p>
+    <w:p>
+      <w:pPr>
         <w:spacing w:after="40"/>
         <w:ind w:left="227"/>
       </w:pPr>
@@ -8459,7 +8588,7 @@
         <w:t>Da appostamenti di questo ufficio e da segnalazioni ripetute dei residenti (motori a tarda notte), il gruppo dispone in uso stabile di un capannone tra i capannoni industriali di Murasakino, Kita-ku: una ex fabbrica con cortile di carico e guardiola sull'ingresso. Le due CBX400F vi sono state viste rientrare più volte, anche nelle ultime settimane.</w:t>
         <w:br/>
         <w:br/>
-        <w:t>Si allega planimetria di massima. Si raccomanda prudenza: il gruppo non ha mai mostrato disponibilità al dialogo con questo ufficio.</w:t>
+        <w:t>Il posto è noto a questo ufficio, che fornisce al distretto le indicazioni per raggiungerlo. Si raccomanda prudenza: il gruppo non ha mai mostrato disponibilità al dialogo con questo ufficio.</w:t>
         <w:br/>
         <w:br/>
         <w:t>Il capo posto — SUZUKI Nobuyuki 鈴木 信之</w:t>
@@ -8481,6 +8610,21 @@
     </w:p>
     <w:p>
       <w:pPr>
+        <w:spacing w:after="60" w:before="0"/>
+        <w:ind w:left="454"/>
+      </w:pPr>
+      <w:r>
+        <w:rPr>
+          <w:b w:val="0"/>
+          <w:i w:val="0"/>
+          <w:color w:val="8B1A1A"/>
+          <w:sz w:val="18"/>
+        </w:rPr>
+        <w:t>AVVISO PER IL MASTER — CONSEGNA: Dal 25/05/1997, dopo una richiesta specifica sul ritrovo del gruppo (anche insieme alla richiesta sulle moto, se i PG la formulano): indicazioni entro un’ora, copia scritta entro due ore. La risposta permette di raggiungere il capannone, senza un altro ostacolo sull’indirizzo. MAPPA E TRE IMMAGINI DEL COVO: materiale di scena del master, da mostrare solo nel finale al capannone, per ambientazione e combattimento; non sono allegati da consegnare con questa risposta.</w:t>
+      </w:r>
+    </w:p>
+    <w:p>
+      <w:pPr>
         <w:spacing w:after="40"/>
         <w:ind w:left="227"/>
       </w:pPr>
@@ -9308,6 +9452,20 @@
     </w:p>
     <w:p>
       <w:pPr>
+        <w:spacing w:after="60" w:before="0"/>
+        <w:ind w:left="227"/>
+      </w:pPr>
+      <w:r>
+        <w:rPr>
+          <w:b w:val="0"/>
+          <w:i w:val="0"/>
+          <w:sz w:val="21"/>
+        </w:rPr>
+        <w:t>999       eliminare il soggetto</w:t>
+      </w:r>
+    </w:p>
+    <w:p>
+      <w:pPr>
         <w:spacing w:after="180" w:before="0"/>
         <w:ind w:left="227"/>
       </w:pPr>
@@ -9317,7 +9475,7 @@
           <w:i w:val="0"/>
           <w:sz w:val="21"/>
         </w:rPr>
-        <w:t>999       eliminare il soggetto</w:t>
+        <w:t>GM — Le due immagini del cercapersone sono esempi visivi: mostrarle dal Surface soltanto se serve spiegare l’oggetto. Il numero o codice sul display illustrativo non costituisce una nuova traccia e non è una fotografia di un messaggio repertato.</w:t>
       </w:r>
     </w:p>
     <w:p>
@@ -9355,7 +9513,7 @@
           <w:color w:val="706A5E"/>
           <w:sz w:val="19"/>
         </w:rPr>
-        <w:t>Cosa succede comunque, che i giocatori guardino o no.</w:t>
+        <w:t>Date assolute e condizioni di consegna. Il giorno 1 è domenica 25 maggio 1997. Gli eventi facoltativi si omettono se superati dalle azioni dei PG; i tempi relativi decorrono dalla richiesta effettiva.</w:t>
       </w:r>
     </w:p>
     <w:p>
@@ -9369,7 +9527,7 @@
           <w:color w:val="1A1A2E"/>
           <w:sz w:val="21"/>
         </w:rPr>
-        <w:t>Giorno 1 · mattina</w:t>
+        <w:t>Giorno 1 · Domenica 25/05/1997 — mattina</w:t>
       </w:r>
     </w:p>
     <w:p>
@@ -9383,7 +9541,323 @@
           <w:i w:val="0"/>
           <w:sz w:val="20"/>
         </w:rPr>
-        <w:t>Articolo del Kyoto Shinbun (26 maggio 1997, pagina 3, cronaca locale). Titolo: «Giovane studente ucciso a Shimogyo». Il trafiletto riferisce che Shimada Yuta, 21 anni, studente di medicina, è stato ucciso sabato notte presso lo snack bar SnakUp con un colpo contundente. Secondo i testimoni, un gruppo di circa 4-5 giovani è entrato nel locale intorno alle 21:15, ha litigato verbalmente con il personale, e uno di loro ha colpito Shimada. Gli aggressori sono fuggiti in motocicletta. Le identità rimangono ignote. La polizia invita chiunque abbia informazioni a contattare il koban locale.</w:t>
+        <w:t>Briefing d’apertura e inizio dell’indagine. Il delitto è di sabato 24/05/1997: arrivo della banda alle 21:14 circa, colpo mortale alle 21:15 circa. Nessun giornale sul caso è ancora disponibile; il referto autoptico arriva il 26 alle 15:00. I PG possono già visitare testimoni e luoghi. I verbali si consegnano dopo ciascun colloquio e si datano allora. Noriko non è bloccata fino al giornale: se i PG la avvertono il 25, verbalizzare la scena effettiva senza usare il suo verbale prestampato che cita il giornale del 26.</w:t>
+      </w:r>
+    </w:p>
+    <w:p>
+      <w:pPr>
+        <w:keepNext/>
+        <w:spacing w:after="20"/>
+      </w:pPr>
+      <w:r>
+        <w:rPr>
+          <w:b/>
+          <w:color w:val="1A1A2E"/>
+          <w:sz w:val="21"/>
+        </w:rPr>
+        <w:t>Giorno 1 · Dal 25/05/1997 — su richiesta, in qualsiasi giorno successivo</w:t>
+      </w:r>
+    </w:p>
+    <w:p>
+      <w:pPr>
+        <w:spacing w:after="60" w:before="0"/>
+        <w:ind w:left="283"/>
+      </w:pPr>
+      <w:r>
+        <w:rPr>
+          <w:b w:val="0"/>
+          <w:i w:val="0"/>
+          <w:sz w:val="20"/>
+        </w:rPr>
+        <w:t>Moto e ritrovo sono informazioni già note al kōban: risposta telefonica entro un’ora, documento scritto entro due ore dalla richiesta. La richiesta sulle moto dà il fascicolo CBX400F e quello fotografico di Matsui. Una richiesta specifica sul ritrovo dà le indicazioni per raggiungere il covo. Se i PG chiedono entrambe le cose insieme, rispondere a entrambe. Questi tempi sostituiscono, per i due riscontri locali, i tempi generici di trasferimento interdistrettuale del dossier. Mappa e immagini interne restano al master fino al finale.</w:t>
+      </w:r>
+    </w:p>
+    <w:p>
+      <w:pPr>
+        <w:spacing w:after="120"/>
+        <w:ind w:left="283"/>
+      </w:pPr>
+      <w:r>
+        <w:rPr>
+          <w:b/>
+          <w:color w:val="1A1A2E"/>
+          <w:sz w:val="19"/>
+        </w:rPr>
+        <w:t xml:space="preserve">Solo se: </w:t>
+      </w:r>
+      <w:r>
+        <w:rPr>
+          <w:sz w:val="19"/>
+        </w:rPr>
+        <w:t>Richiesta pertinente dei PG al kōban.</w:t>
+      </w:r>
+    </w:p>
+    <w:p>
+      <w:pPr>
+        <w:keepNext/>
+        <w:spacing w:after="20"/>
+      </w:pPr>
+      <w:r>
+        <w:rPr>
+          <w:b/>
+          <w:color w:val="1A1A2E"/>
+          <w:sz w:val="21"/>
+        </w:rPr>
+        <w:t>Giorno 2 · Lunedì 26/05/1997 — mattina</w:t>
+      </w:r>
+    </w:p>
+    <w:p>
+      <w:pPr>
+        <w:spacing w:after="60" w:before="0"/>
+        <w:ind w:left="283"/>
+      </w:pPr>
+      <w:r>
+        <w:rPr>
+          <w:b w:val="0"/>
+          <w:i w:val="0"/>
+          <w:sz w:val="20"/>
+        </w:rPr>
+        <w:t>Articolo del Kyoto Shinbun (26 maggio 1997, pagina 3, cronaca locale). Titolo: «Giovane studente ucciso a Shimogyo». Il trafiletto riferisce che Shimada Yuta, 21 anni, studente di medicina, è stato ucciso sabato notte presso lo snack bar SnakUp con un colpo contundente. Secondo i testimoni, un gruppo di circa 4-5 giovani è entrato nel locale intorno alle 21:15, ha litigato verbalmente con il personale, e uno di loro ha colpito Shimada. Gli aggressori sono fuggiti in motocicletta. Le identità rimangono ignote. La polizia invita chiunque abbia informazioni a contattare il koban locale. Prima uscita sulla vicenda. Se non è stata già informata dai PG, Noriko apprende la morte da questo giornale; dal 26 si trova a casa e non va a scuola per una settimana. Il suo verbale prestampato si consegna solo dopo il colloquio e solo se ha appreso la notizia così.</w:t>
+      </w:r>
+    </w:p>
+    <w:p>
+      <w:pPr>
+        <w:spacing w:after="120"/>
+        <w:ind w:left="283"/>
+      </w:pPr>
+      <w:r>
+        <w:rPr>
+          <w:b/>
+          <w:color w:val="1A1A2E"/>
+          <w:sz w:val="19"/>
+        </w:rPr>
+        <w:t xml:space="preserve">Solo se: </w:t>
+      </w:r>
+      <w:r>
+        <w:rPr>
+          <w:sz w:val="19"/>
+        </w:rPr>
+        <w:t>Notizie ancora compatibili con gli eventi giocati.</w:t>
+      </w:r>
+    </w:p>
+    <w:p>
+      <w:pPr>
+        <w:keepNext/>
+        <w:spacing w:after="20"/>
+      </w:pPr>
+      <w:r>
+        <w:rPr>
+          <w:b/>
+          <w:color w:val="1A1A2E"/>
+          <w:sz w:val="21"/>
+        </w:rPr>
+        <w:t>Giorno 2 · Lunedì 26/05/1997 — ore 15:00</w:t>
+      </w:r>
+    </w:p>
+    <w:p>
+      <w:pPr>
+        <w:spacing w:after="60" w:before="0"/>
+        <w:ind w:left="283"/>
+      </w:pPr>
+      <w:r>
+        <w:rPr>
+          <w:b w:val="0"/>
+          <w:i w:val="0"/>
+          <w:sz w:val="20"/>
+        </w:rPr>
+        <w:t>La Scientifica rende disponibile il referto autoptico. Esame eseguito d’ufficio alle 09:00 del 26, emissione alle 15:00; decesso il 24 alle 21:15 circa. Gli esami tossicologici sono preliminari; quelli completi sono ancora in corso. Il referto può essere ritirato anche più tardi, mantenendo la vera data di emissione.</w:t>
+      </w:r>
+    </w:p>
+    <w:p>
+      <w:pPr>
+        <w:keepNext/>
+        <w:spacing w:after="20"/>
+      </w:pPr>
+      <w:r>
+        <w:rPr>
+          <w:b/>
+          <w:color w:val="1A1A2E"/>
+          <w:sz w:val="21"/>
+        </w:rPr>
+        <w:t>Giorno 2 · Dal lunedì 26/05/1997 — tabulato a richiesta +24 ore</w:t>
+      </w:r>
+    </w:p>
+    <w:p>
+      <w:pPr>
+        <w:spacing w:after="60" w:before="0"/>
+        <w:ind w:left="283"/>
+      </w:pPr>
+      <w:r>
+        <w:rPr>
+          <w:b w:val="0"/>
+          <w:i w:val="0"/>
+          <w:sz w:val="20"/>
+        </w:rPr>
+        <w:t>Consegnare 24 ore dopo la richiesta autorizzata e inoltrata a NTT, mai prima di aver acquisito l’utenza di Noriko. Compilare sul foglio entrambe le date e le ore: richiesta 25/05/1997 ore 12:00 → evasione 26/05 ore 12:00; richiesta 26/05 ore 12:00 → evasione 27/05 ore 12:00; richiesta 27/05 ore 12:00 → evasione 28/05 ore 12:00. Per richieste successive vale sempre +24 ore. Sono tempi di gioco per questo caso. Il periodo analizzato resta 01/02–24/05/1997, indipendentemente dalla data di evasione: non documenta le minacce dopo il delitto. Approfondimento facoltativo: non ritardare la chiusura del caso per aspettarlo. Le traduzioni sono già incluse; i numeri delle cabine non identificano da soli il mittente. Il 26 è la prima data possibile, non una consegna automatica: richiesta autorizzata domenica 25 → lunedì 26 alla stessa ora; lunedì 26 → martedì 27; martedì 27 → mercoledì 28. Il tempo decorre dall’inoltro autorizzato, non dal primo sospetto. Se la richiesta è successiva, spostare entrambe le date compilate sul modulo. Nessun tiro cancella l’indizio; eventuali ritardi si registrano anche nell’ora effettiva di evasione.</w:t>
+      </w:r>
+    </w:p>
+    <w:p>
+      <w:pPr>
+        <w:spacing w:after="120"/>
+        <w:ind w:left="283"/>
+      </w:pPr>
+      <w:r>
+        <w:rPr>
+          <w:b/>
+          <w:color w:val="1A1A2E"/>
+          <w:sz w:val="19"/>
+        </w:rPr>
+        <w:t xml:space="preserve">Solo se: </w:t>
+      </w:r>
+      <w:r>
+        <w:rPr>
+          <w:sz w:val="19"/>
+        </w:rPr>
+        <w:t>Utenza di Noriko acquisita e richiesta autorizzata inoltrata a NTT almeno 24 ore prima.</w:t>
+      </w:r>
+    </w:p>
+    <w:p>
+      <w:pPr>
+        <w:keepNext/>
+        <w:spacing w:after="20"/>
+      </w:pPr>
+      <w:r>
+        <w:rPr>
+          <w:b/>
+          <w:color w:val="1A1A2E"/>
+          <w:sz w:val="21"/>
+        </w:rPr>
+        <w:t>Giorno 3 · Martedì 27/05/1997 — mattina</w:t>
+      </w:r>
+    </w:p>
+    <w:p>
+      <w:pPr>
+        <w:spacing w:after="60" w:before="0"/>
+        <w:ind w:left="283"/>
+      </w:pPr>
+      <w:r>
+        <w:rPr>
+          <w:b w:val="0"/>
+          <w:i w:val="0"/>
+          <w:sz w:val="20"/>
+        </w:rPr>
+        <w:t>Giornale Rakuyō Shinbun del 27/05/1997, n. 3.812. Riprende le testimonianze e la famiglia. Omettere se ridondante o se il caso si è già chiuso. Non attendere questa data per permettere ai PG di risolvere il caso.</w:t>
+      </w:r>
+    </w:p>
+    <w:p>
+      <w:pPr>
+        <w:spacing w:after="120"/>
+        <w:ind w:left="283"/>
+      </w:pPr>
+      <w:r>
+        <w:rPr>
+          <w:b/>
+          <w:color w:val="1A1A2E"/>
+          <w:sz w:val="19"/>
+        </w:rPr>
+        <w:t xml:space="preserve">Solo se: </w:t>
+      </w:r>
+      <w:r>
+        <w:rPr>
+          <w:sz w:val="19"/>
+        </w:rPr>
+        <w:t>Facoltativo; caso ancora aperto e articolo compatibile con i fatti pubblici.</w:t>
+      </w:r>
+    </w:p>
+    <w:p>
+      <w:pPr>
+        <w:keepNext/>
+        <w:spacing w:after="20"/>
+      </w:pPr>
+      <w:r>
+        <w:rPr>
+          <w:b/>
+          <w:color w:val="1A1A2E"/>
+          <w:sz w:val="21"/>
+        </w:rPr>
+        <w:t>Giorno 4 · Mercoledì 28/05/1997 — mattina</w:t>
+      </w:r>
+    </w:p>
+    <w:p>
+      <w:pPr>
+        <w:spacing w:after="60" w:before="0"/>
+        <w:ind w:left="283"/>
+      </w:pPr>
+      <w:r>
+        <w:rPr>
+          <w:b w:val="0"/>
+          <w:i w:val="0"/>
+          <w:sz w:val="20"/>
+        </w:rPr>
+        <w:t>Giornale Rakuyō Shinbun del 28/05/1997, n. 3.813: ipotesi del regolamento di conti. Non consegnare se i PG hanno già preso Matsui o reso pubblica una ricostruzione incompatibile. Nessun evento preparato deve annullare i risultati dei giocatori.</w:t>
+      </w:r>
+    </w:p>
+    <w:p>
+      <w:pPr>
+        <w:spacing w:after="120"/>
+        <w:ind w:left="283"/>
+      </w:pPr>
+      <w:r>
+        <w:rPr>
+          <w:b/>
+          <w:color w:val="1A1A2E"/>
+          <w:sz w:val="19"/>
+        </w:rPr>
+        <w:t xml:space="preserve">Solo se: </w:t>
+      </w:r>
+      <w:r>
+        <w:rPr>
+          <w:sz w:val="19"/>
+        </w:rPr>
+        <w:t>Facoltativo; caso ancora aperto, nessun fermo, voce di stampa ancora plausibile.</w:t>
+      </w:r>
+    </w:p>
+    <w:p>
+      <w:pPr>
+        <w:keepNext/>
+        <w:spacing w:after="20"/>
+      </w:pPr>
+      <w:r>
+        <w:rPr>
+          <w:b/>
+          <w:color w:val="1A1A2E"/>
+          <w:sz w:val="21"/>
+        </w:rPr>
+        <w:t>Giorno 1 · Dal 25/05/1997 — quando si arriva al finale, anche nei giorni successivi</w:t>
+      </w:r>
+    </w:p>
+    <w:p>
+      <w:pPr>
+        <w:spacing w:after="60" w:before="0"/>
+        <w:ind w:left="283"/>
+      </w:pPr>
+      <w:r>
+        <w:rPr>
+          <w:b w:val="0"/>
+          <w:i w:val="0"/>
+          <w:sz w:val="20"/>
+        </w:rPr>
+        <w:t>Mostrare planimetria e tre immagini del capannone solo al finale, per immersione e combattimento. Non anticiparle con la risposta del kōban. Le immagini del cercapersone restano esempi visivi da mostrare su richiesta: il display illustrativo non è un indizio. Il caso può chiudersi prima dell’autopsia, del tabulato o dei giornali facoltativi, se le testimonianze e l’indagine hanno già portato a Matsui.</w:t>
+      </w:r>
+    </w:p>
+    <w:p>
+      <w:pPr>
+        <w:spacing w:after="120"/>
+        <w:ind w:left="283"/>
+      </w:pPr>
+      <w:r>
+        <w:rPr>
+          <w:b/>
+          <w:color w:val="1A1A2E"/>
+          <w:sz w:val="19"/>
+        </w:rPr>
+        <w:t xml:space="preserve">Solo se: </w:t>
+      </w:r>
+      <w:r>
+        <w:rPr>
+          <w:sz w:val="19"/>
+        </w:rPr>
+        <w:t>I PG raggiungono il covo; non è una scena fissata al quarto giorno.</w:t>
       </w:r>
     </w:p>
     <w:p>

</xml_diff>

<commit_message>
vault backup: 2026-09-16 20:11:17
</commit_message>
<xml_diff>
--- a/Investigare/Avventura Tanto Rumore/DOSSIER_GM.docx
+++ b/Investigare/Avventura Tanto Rumore/DOSSIER_GM.docx
@@ -594,7 +594,7 @@
         <w:rPr>
           <w:sz w:val="20"/>
         </w:rPr>
-        <w:t>Innamorato della sua compagna di classe Watanabe</w:t>
+        <w:t>Innamorato di Watanabe Noriko, che frequenta lo stesso complesso scolastico ma non la sua classe</w:t>
       </w:r>
     </w:p>
     <w:p>
@@ -1293,7 +1293,7 @@
           <w:i w:val="0"/>
           <w:sz w:val="20"/>
         </w:rPr>
-        <w:t>· Shimada Yumiko — Sorella minore</w:t>
+        <w:t>· Shimada Yumiko — Sorella maggiore</w:t>
       </w:r>
     </w:p>
     <w:p>
@@ -3540,7 +3540,7 @@
           <w:color w:val="706A5E"/>
           <w:sz w:val="19"/>
         </w:rPr>
-        <w:t>23 anni · donna · Sorella minore — nel mondo della vittima</w:t>
+        <w:t>23 anni · donna · Sorella maggiore — nel mondo della vittima</w:t>
       </w:r>
     </w:p>
     <w:p>

</xml_diff>

<commit_message>
vault backup: 2026-09-17 22:29:59
</commit_message>
<xml_diff>
--- a/Investigare/Avventura Tanto Rumore/DOSSIER_GM.docx
+++ b/Investigare/Avventura Tanto Rumore/DOSSIER_GM.docx
@@ -211,7 +211,7 @@
           <w:i w:val="0"/>
           <w:sz w:val="25"/>
         </w:rPr>
-        <w:t>È morto colpito alla testa con un oggetto contundente.</w:t>
+        <w:t>Matsui Kenta ha ucciso Yuta con un unico colpo di tonfa alla testa, da dietro.</w:t>
       </w:r>
     </w:p>
     <w:tbl>
@@ -574,7 +574,7 @@
         <w:rPr>
           <w:sz w:val="20"/>
         </w:rPr>
-        <w:t>Frequentava un gruppo di giovani della yakuza</w:t>
+        <w:t>Le presunte frequentazioni di Yuta con la Yakuza sono voci false: Yuta non ha alcun legame con quegli ambienti. Per il master: qualsiasi ricerca, controllo degli archivi, domanda a testimoni o verifica tramite contatti dà esito negativo. Non emergono frequentazioni, debiti o collegamenti con la Yakuza; non ci sono legami nascosti da scoprire. La pista si esaurisce con questi riscontri, senza bloccare l’indagine. Il movente resta la gelosia di Matsui.</w:t>
       </w:r>
       <w:r>
         <w:rPr>
@@ -1068,7 +1068,7 @@
           <w:i w:val="0"/>
           <w:sz w:val="21"/>
         </w:rPr>
-        <w:t>Alle 21:14 circa arriva la banda; il colpo mortale viene sferrato intorno alle 21:15. La banda al completo arriva sul lavoro della vittima, con scuse, cosi diranno i testimoni, attaccano briga con la vittima che viene uccisa con un colpo alle spalle con un oggetto contundente. Se mostrate le foto vengono riconosciuti dal collega e dal titolare ma il titolare non collaborano subito ha paura di ritorsioni, la dipendente dice che era nel retro ed è rientrata in sala solo dopo il colpo; in realtà era in sala e ha visto tutto.</w:t>
+        <w:t>Alle 21:14 circa arriva la banda; il colpo mortale viene sferrato intorno alle 21:15. La banda al completo arriva sul lavoro della vittima, con scuse, cosi diranno i testimoni, attaccano briga con la vittima che viene uccisa da Matsui Kenta con un unico colpo di tonfa alla testa, da dietro. Se mostrate le foto vengono riconosciuti dal collega e dal titolare ma il titolare non collaborano subito ha paura di ritorsioni, la dipendente dice che era nel retro ed è rientrata in sala solo dopo il colpo; in realtà era in sala e ha visto tutto.</w:t>
       </w:r>
     </w:p>
     <w:p>
@@ -1504,7 +1504,7 @@
           <w:i w:val="0"/>
           <w:sz w:val="21"/>
         </w:rPr>
-        <w:t>L'assassino, ha organizzato il tutto</w:t>
+        <w:t>L'assassino, ha organizzato il tutto. Ha colpito Yuta da dietro alla testa con un tonfa, causandone la morte.</w:t>
       </w:r>
     </w:p>
     <w:p>
@@ -1872,7 +1872,7 @@
           <w:i w:val="0"/>
           <w:sz w:val="19"/>
         </w:rPr>
-        <w:t>· 1997-05-24 21:14 · SnakUp — Alle 21:14 circa arriva la banda; il colpo mortale viene sferrato intorno alle 21:15. La banda al completo arriva sul lavoro della vittima, con scuse, cosi diranno i testimoni, attaccano briga con la vittima che viene uccisa con un colpo alle spalle con un oggetto contundente. Se mostrate le foto vengono riconosciuti dal collega e dal titolare ma il titolare non collaborano subito ha paura di ritorsioni, la dipendente dice che era nel retro ed è rientrata in sala solo dopo il colpo; in realtà era in sala e ha visto tutto.</w:t>
+        <w:t>· 1997-05-24 21:14 · SnakUp — Alle 21:14 circa arriva la banda; il colpo mortale viene sferrato intorno alle 21:15. La banda al completo arriva sul lavoro della vittima, con scuse, cosi diranno i testimoni, attaccano briga con la vittima che viene uccisa da Matsui Kenta con un unico colpo di tonfa alla testa, da dietro. Se mostrate le foto vengono riconosciuti dal collega e dal titolare ma il titolare non collaborano subito ha paura di ritorsioni, la dipendente dice che era nel retro ed è rientrata in sala solo dopo il colpo; in realtà era in sala e ha visto tutto.</w:t>
       </w:r>
     </w:p>
     <w:p>
@@ -2388,7 +2388,7 @@
           <w:i w:val="0"/>
           <w:sz w:val="21"/>
         </w:rPr>
-        <w:t>FALSO: "ero nel retro" — era in sala e ha visto tutto, compreso chi ha colpito.</w:t>
+        <w:t>FALSO: "ero nel retro" — era in sala e ha visto tutto, compreso chi ha colpito. Quando si sente protetta e racconta la verità, può descrivere anche il tonfa, un manganello con impugnatura laterale, usato da Matsui.</w:t>
       </w:r>
     </w:p>
     <w:p>
@@ -2521,7 +2521,7 @@
           <w:i w:val="0"/>
           <w:sz w:val="19"/>
         </w:rPr>
-        <w:t>· 1997-05-24 21:14 · SnakUp — Alle 21:14 circa arriva la banda; il colpo mortale viene sferrato intorno alle 21:15. La banda al completo arriva sul lavoro della vittima, con scuse, cosi diranno i testimoni, attaccano briga con la vittima che viene uccisa con un colpo alle spalle con un oggetto contundente. Se mostrate le foto vengono riconosciuti dal collega e dal titolare ma il titolare non collaborano subito ha paura di ritorsioni, la dipendente dice che era nel retro ed è rientrata in sala solo dopo il colpo; in realtà era in sala e ha visto tutto.</w:t>
+        <w:t>· 1997-05-24 21:14 · SnakUp — Alle 21:14 circa arriva la banda; il colpo mortale viene sferrato intorno alle 21:15. La banda al completo arriva sul lavoro della vittima, con scuse, cosi diranno i testimoni, attaccano briga con la vittima che viene uccisa da Matsui Kenta con un unico colpo di tonfa alla testa, da dietro. Se mostrate le foto vengono riconosciuti dal collega e dal titolare ma il titolare non collaborano subito ha paura di ritorsioni, la dipendente dice che era nel retro ed è rientrata in sala solo dopo il colpo; in realtà era in sala e ha visto tutto.</w:t>
       </w:r>
     </w:p>
     <w:p>
@@ -2891,7 +2891,7 @@
           <w:i w:val="0"/>
           <w:sz w:val="19"/>
         </w:rPr>
-        <w:t>· 1997-05-24 21:14 · SnakUp — Alle 21:14 circa arriva la banda; il colpo mortale viene sferrato intorno alle 21:15. La banda al completo arriva sul lavoro della vittima, con scuse, cosi diranno i testimoni, attaccano briga con la vittima che viene uccisa con un colpo alle spalle con un oggetto contundente. Se mostrate le foto vengono riconosciuti dal collega e dal titolare ma il titolare non collaborano subito ha paura di ritorsioni, la dipendente dice che era nel retro ed è rientrata in sala solo dopo il colpo; in realtà era in sala e ha visto tutto.</w:t>
+        <w:t>· 1997-05-24 21:14 · SnakUp — Alle 21:14 circa arriva la banda; il colpo mortale viene sferrato intorno alle 21:15. La banda al completo arriva sul lavoro della vittima, con scuse, cosi diranno i testimoni, attaccano briga con la vittima che viene uccisa da Matsui Kenta con un unico colpo di tonfa alla testa, da dietro. Se mostrate le foto vengono riconosciuti dal collega e dal titolare ma il titolare non collaborano subito ha paura di ritorsioni, la dipendente dice che era nel retro ed è rientrata in sala solo dopo il colpo; in realtà era in sala e ha visto tutto.</w:t>
       </w:r>
     </w:p>
     <w:p>
@@ -4229,7 +4229,7 @@
           <w:i w:val="0"/>
           <w:sz w:val="19"/>
         </w:rPr>
-        <w:t>· 1997-05-24 21:14 · SnakUp — Alle 21:14 circa arriva la banda; il colpo mortale viene sferrato intorno alle 21:15. La banda al completo arriva sul lavoro della vittima, con scuse, cosi diranno i testimoni, attaccano briga con la vittima che viene uccisa con un colpo alle spalle con un oggetto contundente. Se mostrate le foto vengono riconosciuti dal collega e dal titolare ma il titolare non collaborano subito ha paura di ritorsioni, la dipendente dice che era nel retro ed è rientrata in sala solo dopo il colpo; in realtà era in sala e ha visto tutto.</w:t>
+        <w:t>· 1997-05-24 21:14 · SnakUp — Alle 21:14 circa arriva la banda; il colpo mortale viene sferrato intorno alle 21:15. La banda al completo arriva sul lavoro della vittima, con scuse, cosi diranno i testimoni, attaccano briga con la vittima che viene uccisa da Matsui Kenta con un unico colpo di tonfa alla testa, da dietro. Se mostrate le foto vengono riconosciuti dal collega e dal titolare ma il titolare non collaborano subito ha paura di ritorsioni, la dipendente dice che era nel retro ed è rientrata in sala solo dopo il colpo; in realtà era in sala e ha visto tutto.</w:t>
       </w:r>
     </w:p>
     <w:p>
@@ -4805,7 +4805,7 @@
           <w:i w:val="0"/>
           <w:sz w:val="19"/>
         </w:rPr>
-        <w:t>· 1997-05-24 21:14 · SnakUp — Alle 21:14 circa arriva la banda; il colpo mortale viene sferrato intorno alle 21:15. La banda al completo arriva sul lavoro della vittima, con scuse, cosi diranno i testimoni, attaccano briga con la vittima che viene uccisa con un colpo alle spalle con un oggetto contundente. Se mostrate le foto vengono riconosciuti dal collega e dal titolare ma il titolare non collaborano subito ha paura di ritorsioni, la dipendente dice che era nel retro ed è rientrata in sala solo dopo il colpo; in realtà era in sala e ha visto tutto.</w:t>
+        <w:t>· 1997-05-24 21:14 · SnakUp — Alle 21:14 circa arriva la banda; il colpo mortale viene sferrato intorno alle 21:15. La banda al completo arriva sul lavoro della vittima, con scuse, cosi diranno i testimoni, attaccano briga con la vittima che viene uccisa da Matsui Kenta con un unico colpo di tonfa alla testa, da dietro. Se mostrate le foto vengono riconosciuti dal collega e dal titolare ma il titolare non collaborano subito ha paura di ritorsioni, la dipendente dice che era nel retro ed è rientrata in sala solo dopo il colpo; in realtà era in sala e ha visto tutto.</w:t>
       </w:r>
     </w:p>
     <w:p>
@@ -5015,7 +5015,7 @@
           <w:i w:val="0"/>
           <w:sz w:val="21"/>
         </w:rPr>
-        <w:t>Sa che tengono delle armi da fuoco nel covo, il suo ex se ne vantava spesso. Veniva chiamata sul suo Pocket Ball ma da qualche settimana</w:t>
+        <w:t>Sa che tengono delle armi da fuoco nel covo, il suo ex se ne vantava spesso. Riceve sul suo Pocket Bell messaggi numerici che la spaventano, anche di notte. Nel primo colloquio resta reticente per paura; quando si sente protetta, collabora e parla del suo ex Matsui Kenta.</w:t>
       </w:r>
     </w:p>
     <w:p>
@@ -5788,7 +5788,7 @@
           <w:i w:val="0"/>
           <w:sz w:val="19"/>
         </w:rPr>
-        <w:t>· 1997-05-24 21:14 · SnakUp — Alle 21:14 circa arriva la banda; il colpo mortale viene sferrato intorno alle 21:15. La banda al completo arriva sul lavoro della vittima, con scuse, cosi diranno i testimoni, attaccano briga con la vittima che viene uccisa con un colpo alle spalle con un oggetto contundente. Se mostrate le foto vengono riconosciuti dal collega e dal titolare ma il titolare non collaborano subito ha paura di ritorsioni, la dipendente dice che era nel retro ed è rientrata in sala solo dopo il colpo; in realtà era in sala e ha visto tutto.</w:t>
+        <w:t>· 1997-05-24 21:14 · SnakUp — Alle 21:14 circa arriva la banda; il colpo mortale viene sferrato intorno alle 21:15. La banda al completo arriva sul lavoro della vittima, con scuse, cosi diranno i testimoni, attaccano briga con la vittima che viene uccisa da Matsui Kenta con un unico colpo di tonfa alla testa, da dietro. Se mostrate le foto vengono riconosciuti dal collega e dal titolare ma il titolare non collaborano subito ha paura di ritorsioni, la dipendente dice che era nel retro ed è rientrata in sala solo dopo il colpo; in realtà era in sala e ha visto tutto.</w:t>
       </w:r>
     </w:p>
     <w:p>
@@ -5872,7 +5872,7 @@
           <w:i/>
           <w:sz w:val="20"/>
         </w:rPr>
-        <w:t>Posso avere dell'acqua? Se mio padre lo sa mi ammazza. [Se isolato dagli altri e trattato con calma: piange, e conferma tutto — chi è entrato, chi ha colpito, con cosa.]</w:t>
+        <w:t>Posso avere dell'acqua? Se mio padre lo sa mi ammazza. [Se isolato dagli altri e trattato con calma: piange, e conferma tutto — chi è entrato e che Matsui ha colpito Yuta con un tonfa, un manganello con impugnatura laterale.]</w:t>
       </w:r>
     </w:p>
     <w:p>
@@ -6361,7 +6361,7 @@
           <w:i/>
           <w:sz w:val="20"/>
         </w:rPr>
-        <w:t>I capannoni di Murasakino, Kita-ku: lamiera, ruggine e erba nelle crepe del cemento. Un cortile di carico con il cancello scorrevole, una guardiola all'ingresso col vetro rotto. Sotto una tettoia, due Honda CBX400F gemelle, bianche e rosse — e se i motori sono accesi, il canto della yonfore si riconosce a tre isolati.</w:t>
+        <w:t>I capannoni di Murasakino, Kita-ku: lamiera, ruggine e erba nelle crepe del cemento. Un cortile di carico con il cancello scorrevole, una guardiola all'ingresso col vetro rotto e una tettoia sul lato del cortile. Se nel capannone i motori sono accesi, il canto della yonfore si riconosce a tre isolati.</w:t>
       </w:r>
     </w:p>
     <w:p>
@@ -6389,7 +6389,7 @@
           <w:i/>
           <w:sz w:val="20"/>
         </w:rPr>
-        <w:t>Dentro, la vecchia fabbrica smontata: le linee ferme, gli spogliatoi con gli armadietti sfondati, attrezzi e catene appesi, odore di benzina e grasso. L'ufficio del capoturno è diventato l'angolo di Matsui: una poltrona sfondata, poster di moto, casse di birra vuote. Materassi per terra: qualcuno qui ci dorme.</w:t>
+        <w:t>Dentro, la vecchia fabbrica smontata: le linee ferme, gli spogliatoi con gli armadietti sfondati, attrezzi e catene appesi, odore di benzina e grasso. Due Honda CBX400F gemelle, bianche e rosse, sono parcheggiate all'interno, vicino alla saracinesca che dà sul cortile di carico. L'ufficio del capoturno è diventato l'angolo di Matsui: una poltrona sfondata, poster di moto, casse di birra vuote. Materassi per terra: qualcuno qui ci dorme.</w:t>
       </w:r>
     </w:p>
     <w:p>

</xml_diff>